<commit_message>
Implemented QA testing feedback
</commit_message>
<xml_diff>
--- a/docassemble/PetitionForRuleToShowCauseFamily/data/templates/order_rule_family.docx
+++ b/docassemble/PetitionForRuleToShowCauseFamily/data/templates/order_rule_family.docx
@@ -11,7 +11,31 @@
         <w:ind w:left="0"/>
       </w:pPr>
       <w:r>
-        <w:t>IN THE CIRCUIT COURT OF {{trial_court.address.county.upper()}} COUNTY, ILLINOIS</w:t>
+        <w:t>IN THE CIRCUIT COURT OF {{</w:t>
+      </w:r>
+      <w:proofErr w:type="spellStart"/>
+      <w:r>
+        <w:t>trial_</w:t>
+      </w:r>
+      <w:proofErr w:type="gramStart"/>
+      <w:r>
+        <w:t>court.address</w:t>
+      </w:r>
+      <w:proofErr w:type="gramEnd"/>
+      <w:r>
+        <w:t>.</w:t>
+      </w:r>
+      <w:proofErr w:type="gramStart"/>
+      <w:r>
+        <w:t>county.upper</w:t>
+      </w:r>
+      <w:proofErr w:type="spellEnd"/>
+      <w:r>
+        <w:t>()}}</w:t>
+      </w:r>
+      <w:proofErr w:type="gramEnd"/>
+      <w:r>
+        <w:t xml:space="preserve"> COUNTY, ILLINOIS</w:t>
       </w:r>
     </w:p>
     <w:p>
@@ -70,27 +94,93 @@
                 <w:sz w:val="12"/>
                 <w:szCs w:val="12"/>
               </w:rPr>
-              <w:t>{% if in_re_check %}</w:t>
-            </w:r>
-            <w:r>
-              <w:rPr>
-                <w:b/>
-              </w:rPr>
-              <w:t xml:space="preserve">In re: </w:t>
-            </w:r>
-            <w:r>
-              <w:rPr>
-                <w:b/>
-              </w:rPr>
-              <w:t>{{in_re_label}}</w:t>
-            </w:r>
+              <w:t xml:space="preserve">{% if </w:t>
+            </w:r>
+            <w:proofErr w:type="spellStart"/>
             <w:r>
               <w:rPr>
                 <w:b/>
                 <w:sz w:val="12"/>
                 <w:szCs w:val="12"/>
               </w:rPr>
-              <w:t>{% endif %}</w:t>
+              <w:t>in_re_check</w:t>
+            </w:r>
+            <w:proofErr w:type="spellEnd"/>
+            <w:r>
+              <w:rPr>
+                <w:b/>
+                <w:sz w:val="12"/>
+                <w:szCs w:val="12"/>
+              </w:rPr>
+              <w:t xml:space="preserve"> </w:t>
+            </w:r>
+            <w:proofErr w:type="gramStart"/>
+            <w:r>
+              <w:rPr>
+                <w:b/>
+                <w:sz w:val="12"/>
+                <w:szCs w:val="12"/>
+              </w:rPr>
+              <w:t>%}</w:t>
+            </w:r>
+            <w:r>
+              <w:rPr>
+                <w:b/>
+              </w:rPr>
+              <w:t>In</w:t>
+            </w:r>
+            <w:proofErr w:type="gramEnd"/>
+            <w:r>
+              <w:rPr>
+                <w:b/>
+              </w:rPr>
+              <w:t xml:space="preserve"> </w:t>
+            </w:r>
+            <w:proofErr w:type="gramStart"/>
+            <w:r>
+              <w:rPr>
+                <w:b/>
+              </w:rPr>
+              <w:t xml:space="preserve">re: </w:t>
+            </w:r>
+            <w:r>
+              <w:rPr>
+                <w:b/>
+              </w:rPr>
+              <w:t>{{</w:t>
+            </w:r>
+            <w:proofErr w:type="spellStart"/>
+            <w:proofErr w:type="gramEnd"/>
+            <w:r>
+              <w:rPr>
+                <w:b/>
+              </w:rPr>
+              <w:t>in_re_label</w:t>
+            </w:r>
+            <w:proofErr w:type="spellEnd"/>
+            <w:proofErr w:type="gramStart"/>
+            <w:r>
+              <w:rPr>
+                <w:b/>
+              </w:rPr>
+              <w:t>}}</w:t>
+            </w:r>
+            <w:r>
+              <w:rPr>
+                <w:b/>
+                <w:sz w:val="12"/>
+                <w:szCs w:val="12"/>
+              </w:rPr>
+              <w:t>{</w:t>
+            </w:r>
+            <w:proofErr w:type="gramEnd"/>
+            <w:r>
+              <w:rPr>
+                <w:b/>
+                <w:sz w:val="12"/>
+                <w:szCs w:val="12"/>
+              </w:rPr>
+              <w:t>% endif %}</w:t>
             </w:r>
           </w:p>
         </w:tc>
@@ -251,7 +341,21 @@
               <w:rPr>
                 <w:b/>
               </w:rPr>
-              <w:t>{{case_number}}</w:t>
+              <w:t>{{</w:t>
+            </w:r>
+            <w:proofErr w:type="spellStart"/>
+            <w:r>
+              <w:rPr>
+                <w:b/>
+              </w:rPr>
+              <w:t>case_number</w:t>
+            </w:r>
+            <w:proofErr w:type="spellEnd"/>
+            <w:r>
+              <w:rPr>
+                <w:b/>
+              </w:rPr>
+              <w:t>}}</w:t>
             </w:r>
           </w:p>
         </w:tc>
@@ -297,14 +401,85 @@
               <w:rPr>
                 <w:b/>
               </w:rPr>
-              <w:t>{% if party_label == “plaintiff” or party_label == “petitioner” %}</w:t>
-            </w:r>
-            <w:r>
-              <w:rPr>
-                <w:b/>
-              </w:rPr>
-              <w:t>{{users[0].name_full()</w:t>
-            </w:r>
+              <w:t xml:space="preserve">{% if </w:t>
+            </w:r>
+            <w:proofErr w:type="spellStart"/>
+            <w:r>
+              <w:rPr>
+                <w:b/>
+              </w:rPr>
+              <w:t>party_label</w:t>
+            </w:r>
+            <w:proofErr w:type="spellEnd"/>
+            <w:r>
+              <w:rPr>
+                <w:b/>
+              </w:rPr>
+              <w:t xml:space="preserve"> == “plaintiff” or </w:t>
+            </w:r>
+            <w:proofErr w:type="spellStart"/>
+            <w:r>
+              <w:rPr>
+                <w:b/>
+              </w:rPr>
+              <w:t>party_label</w:t>
+            </w:r>
+            <w:proofErr w:type="spellEnd"/>
+            <w:r>
+              <w:rPr>
+                <w:b/>
+              </w:rPr>
+              <w:t xml:space="preserve"> == “petitioner” </w:t>
+            </w:r>
+            <w:proofErr w:type="gramStart"/>
+            <w:r>
+              <w:rPr>
+                <w:b/>
+              </w:rPr>
+              <w:t>%}</w:t>
+            </w:r>
+            <w:r>
+              <w:rPr>
+                <w:b/>
+              </w:rPr>
+              <w:t>{</w:t>
+            </w:r>
+            <w:proofErr w:type="gramEnd"/>
+            <w:r>
+              <w:rPr>
+                <w:b/>
+              </w:rPr>
+              <w:t>{users[0].</w:t>
+            </w:r>
+            <w:proofErr w:type="spellStart"/>
+            <w:r>
+              <w:rPr>
+                <w:b/>
+              </w:rPr>
+              <w:t>name_</w:t>
+            </w:r>
+            <w:proofErr w:type="gramStart"/>
+            <w:r>
+              <w:rPr>
+                <w:b/>
+              </w:rPr>
+              <w:t>full</w:t>
+            </w:r>
+            <w:proofErr w:type="spellEnd"/>
+            <w:r>
+              <w:rPr>
+                <w:b/>
+              </w:rPr>
+              <w:t>(</w:t>
+            </w:r>
+            <w:proofErr w:type="gramEnd"/>
+            <w:r>
+              <w:rPr>
+                <w:b/>
+              </w:rPr>
+              <w:t>)</w:t>
+            </w:r>
+            <w:proofErr w:type="gramStart"/>
             <w:r>
               <w:rPr>
                 <w:b/>
@@ -321,7 +496,21 @@
               <w:rPr>
                 <w:b/>
               </w:rPr>
-              <w:t>{% else %</w:t>
+              <w:t>{</w:t>
+            </w:r>
+            <w:proofErr w:type="gramEnd"/>
+            <w:r>
+              <w:rPr>
+                <w:b/>
+              </w:rPr>
+              <w:t xml:space="preserve">% else </w:t>
+            </w:r>
+            <w:proofErr w:type="gramStart"/>
+            <w:r>
+              <w:rPr>
+                <w:b/>
+              </w:rPr>
+              <w:t>%</w:t>
             </w:r>
             <w:r>
               <w:rPr>
@@ -333,7 +522,70 @@
               <w:rPr>
                 <w:b/>
               </w:rPr>
-              <w:t>{{other_parties[0].name_full()}}{% endif %},</w:t>
+              <w:t>{</w:t>
+            </w:r>
+            <w:proofErr w:type="gramEnd"/>
+            <w:r>
+              <w:rPr>
+                <w:b/>
+              </w:rPr>
+              <w:t>{</w:t>
+            </w:r>
+            <w:proofErr w:type="spellStart"/>
+            <w:r>
+              <w:rPr>
+                <w:b/>
+              </w:rPr>
+              <w:t>other_parties</w:t>
+            </w:r>
+            <w:proofErr w:type="spellEnd"/>
+            <w:r>
+              <w:rPr>
+                <w:b/>
+              </w:rPr>
+              <w:t>[0].</w:t>
+            </w:r>
+            <w:proofErr w:type="spellStart"/>
+            <w:r>
+              <w:rPr>
+                <w:b/>
+              </w:rPr>
+              <w:t>name_</w:t>
+            </w:r>
+            <w:proofErr w:type="gramStart"/>
+            <w:r>
+              <w:rPr>
+                <w:b/>
+              </w:rPr>
+              <w:t>full</w:t>
+            </w:r>
+            <w:proofErr w:type="spellEnd"/>
+            <w:r>
+              <w:rPr>
+                <w:b/>
+              </w:rPr>
+              <w:t>(</w:t>
+            </w:r>
+            <w:proofErr w:type="gramEnd"/>
+            <w:r>
+              <w:rPr>
+                <w:b/>
+              </w:rPr>
+              <w:t>)</w:t>
+            </w:r>
+            <w:proofErr w:type="gramStart"/>
+            <w:r>
+              <w:rPr>
+                <w:b/>
+              </w:rPr>
+              <w:t>}}{</w:t>
+            </w:r>
+            <w:proofErr w:type="gramEnd"/>
+            <w:r>
+              <w:rPr>
+                <w:b/>
+              </w:rPr>
+              <w:t>% endif %},</w:t>
             </w:r>
           </w:p>
         </w:tc>
@@ -774,14 +1026,85 @@
               <w:rPr>
                 <w:b/>
               </w:rPr>
-              <w:t>{% if party_label == “defendant” or party_label == “respondent” %}</w:t>
-            </w:r>
-            <w:r>
-              <w:rPr>
-                <w:b/>
-              </w:rPr>
-              <w:t>{{users[0].name_full()</w:t>
-            </w:r>
+              <w:t xml:space="preserve">{% if </w:t>
+            </w:r>
+            <w:proofErr w:type="spellStart"/>
+            <w:r>
+              <w:rPr>
+                <w:b/>
+              </w:rPr>
+              <w:t>party_label</w:t>
+            </w:r>
+            <w:proofErr w:type="spellEnd"/>
+            <w:r>
+              <w:rPr>
+                <w:b/>
+              </w:rPr>
+              <w:t xml:space="preserve"> == “defendant” or </w:t>
+            </w:r>
+            <w:proofErr w:type="spellStart"/>
+            <w:r>
+              <w:rPr>
+                <w:b/>
+              </w:rPr>
+              <w:t>party_label</w:t>
+            </w:r>
+            <w:proofErr w:type="spellEnd"/>
+            <w:r>
+              <w:rPr>
+                <w:b/>
+              </w:rPr>
+              <w:t xml:space="preserve"> == “respondent” </w:t>
+            </w:r>
+            <w:proofErr w:type="gramStart"/>
+            <w:r>
+              <w:rPr>
+                <w:b/>
+              </w:rPr>
+              <w:t>%}</w:t>
+            </w:r>
+            <w:r>
+              <w:rPr>
+                <w:b/>
+              </w:rPr>
+              <w:t>{</w:t>
+            </w:r>
+            <w:proofErr w:type="gramEnd"/>
+            <w:r>
+              <w:rPr>
+                <w:b/>
+              </w:rPr>
+              <w:t>{users[0].</w:t>
+            </w:r>
+            <w:proofErr w:type="spellStart"/>
+            <w:r>
+              <w:rPr>
+                <w:b/>
+              </w:rPr>
+              <w:t>name_</w:t>
+            </w:r>
+            <w:proofErr w:type="gramStart"/>
+            <w:r>
+              <w:rPr>
+                <w:b/>
+              </w:rPr>
+              <w:t>full</w:t>
+            </w:r>
+            <w:proofErr w:type="spellEnd"/>
+            <w:r>
+              <w:rPr>
+                <w:b/>
+              </w:rPr>
+              <w:t>(</w:t>
+            </w:r>
+            <w:proofErr w:type="gramEnd"/>
+            <w:r>
+              <w:rPr>
+                <w:b/>
+              </w:rPr>
+              <w:t>)</w:t>
+            </w:r>
+            <w:proofErr w:type="gramStart"/>
             <w:r>
               <w:rPr>
                 <w:b/>
@@ -798,7 +1121,21 @@
               <w:rPr>
                 <w:b/>
               </w:rPr>
-              <w:t>{% else %</w:t>
+              <w:t>{</w:t>
+            </w:r>
+            <w:proofErr w:type="gramEnd"/>
+            <w:r>
+              <w:rPr>
+                <w:b/>
+              </w:rPr>
+              <w:t xml:space="preserve">% else </w:t>
+            </w:r>
+            <w:proofErr w:type="gramStart"/>
+            <w:r>
+              <w:rPr>
+                <w:b/>
+              </w:rPr>
+              <w:t>%</w:t>
             </w:r>
             <w:r>
               <w:rPr>
@@ -810,7 +1147,70 @@
               <w:rPr>
                 <w:b/>
               </w:rPr>
-              <w:t>{{other_parties[0].name_full()}}{% endif %},</w:t>
+              <w:t>{</w:t>
+            </w:r>
+            <w:proofErr w:type="gramEnd"/>
+            <w:r>
+              <w:rPr>
+                <w:b/>
+              </w:rPr>
+              <w:t>{</w:t>
+            </w:r>
+            <w:proofErr w:type="spellStart"/>
+            <w:r>
+              <w:rPr>
+                <w:b/>
+              </w:rPr>
+              <w:t>other_parties</w:t>
+            </w:r>
+            <w:proofErr w:type="spellEnd"/>
+            <w:r>
+              <w:rPr>
+                <w:b/>
+              </w:rPr>
+              <w:t>[0].</w:t>
+            </w:r>
+            <w:proofErr w:type="spellStart"/>
+            <w:r>
+              <w:rPr>
+                <w:b/>
+              </w:rPr>
+              <w:t>name_</w:t>
+            </w:r>
+            <w:proofErr w:type="gramStart"/>
+            <w:r>
+              <w:rPr>
+                <w:b/>
+              </w:rPr>
+              <w:t>full</w:t>
+            </w:r>
+            <w:proofErr w:type="spellEnd"/>
+            <w:r>
+              <w:rPr>
+                <w:b/>
+              </w:rPr>
+              <w:t>(</w:t>
+            </w:r>
+            <w:proofErr w:type="gramEnd"/>
+            <w:r>
+              <w:rPr>
+                <w:b/>
+              </w:rPr>
+              <w:t>)</w:t>
+            </w:r>
+            <w:proofErr w:type="gramStart"/>
+            <w:r>
+              <w:rPr>
+                <w:b/>
+              </w:rPr>
+              <w:t>}}{</w:t>
+            </w:r>
+            <w:proofErr w:type="gramEnd"/>
+            <w:r>
+              <w:rPr>
+                <w:b/>
+              </w:rPr>
+              <w:t>% endif %},</w:t>
             </w:r>
           </w:p>
         </w:tc>
@@ -871,7 +1271,21 @@
               <w:rPr>
                 <w:b/>
               </w:rPr>
-              <w:t>{{ivd_number}}</w:t>
+              <w:t>{{</w:t>
+            </w:r>
+            <w:proofErr w:type="spellStart"/>
+            <w:r>
+              <w:rPr>
+                <w:b/>
+              </w:rPr>
+              <w:t>ivd_number</w:t>
+            </w:r>
+            <w:proofErr w:type="spellEnd"/>
+            <w:r>
+              <w:rPr>
+                <w:b/>
+              </w:rPr>
+              <w:t>}}</w:t>
             </w:r>
           </w:p>
         </w:tc>
@@ -1310,14 +1724,84 @@
           <w:sz w:val="24"/>
           <w:szCs w:val="24"/>
         </w:rPr>
-        <w:t xml:space="preserve"> {{other_parties[0].name_full()}}</w:t>
-      </w:r>
-      <w:r>
-        <w:rPr>
-          <w:sz w:val="24"/>
-          <w:szCs w:val="24"/>
-        </w:rPr>
-        <w:t>, {{capitalize(opponent_label)}},</w:t>
+        <w:t xml:space="preserve"> {{</w:t>
+      </w:r>
+      <w:proofErr w:type="spellStart"/>
+      <w:r>
+        <w:rPr>
+          <w:spacing w:val="-5"/>
+          <w:sz w:val="24"/>
+          <w:szCs w:val="24"/>
+        </w:rPr>
+        <w:t>other_parties</w:t>
+      </w:r>
+      <w:proofErr w:type="spellEnd"/>
+      <w:r>
+        <w:rPr>
+          <w:spacing w:val="-5"/>
+          <w:sz w:val="24"/>
+          <w:szCs w:val="24"/>
+        </w:rPr>
+        <w:t>[0].</w:t>
+      </w:r>
+      <w:proofErr w:type="spellStart"/>
+      <w:r>
+        <w:rPr>
+          <w:spacing w:val="-5"/>
+          <w:sz w:val="24"/>
+          <w:szCs w:val="24"/>
+        </w:rPr>
+        <w:t>name_</w:t>
+      </w:r>
+      <w:proofErr w:type="gramStart"/>
+      <w:r>
+        <w:rPr>
+          <w:spacing w:val="-5"/>
+          <w:sz w:val="24"/>
+          <w:szCs w:val="24"/>
+        </w:rPr>
+        <w:t>full</w:t>
+      </w:r>
+      <w:proofErr w:type="spellEnd"/>
+      <w:r>
+        <w:rPr>
+          <w:spacing w:val="-5"/>
+          <w:sz w:val="24"/>
+          <w:szCs w:val="24"/>
+        </w:rPr>
+        <w:t>(</w:t>
+      </w:r>
+      <w:proofErr w:type="gramEnd"/>
+      <w:r>
+        <w:rPr>
+          <w:spacing w:val="-5"/>
+          <w:sz w:val="24"/>
+          <w:szCs w:val="24"/>
+        </w:rPr>
+        <w:t>)}}</w:t>
+      </w:r>
+      <w:r>
+        <w:rPr>
+          <w:sz w:val="24"/>
+          <w:szCs w:val="24"/>
+        </w:rPr>
+        <w:t>, {{capitalize(</w:t>
+      </w:r>
+      <w:proofErr w:type="spellStart"/>
+      <w:r>
+        <w:rPr>
+          <w:sz w:val="24"/>
+          <w:szCs w:val="24"/>
+        </w:rPr>
+        <w:t>opponent_label</w:t>
+      </w:r>
+      <w:proofErr w:type="spellEnd"/>
+      <w:r>
+        <w:rPr>
+          <w:sz w:val="24"/>
+          <w:szCs w:val="24"/>
+        </w:rPr>
+        <w:t>)}},</w:t>
       </w:r>
       <w:r>
         <w:rPr>
@@ -1500,6 +1984,7 @@
         </w:rPr>
         <w:t> </w:t>
       </w:r>
+      <w:proofErr w:type="gramStart"/>
       <w:r>
         <w:rPr>
           <w:spacing w:val="-2"/>
@@ -1520,6 +2005,7 @@
         </w:rPr>
         <w:t>☐</w:t>
       </w:r>
+      <w:proofErr w:type="gramEnd"/>
       <w:r>
         <w:rPr>
           <w:rFonts w:ascii="Times New Roman" w:hAnsi="Times New Roman"/>
@@ -1543,6 +2029,7 @@
         </w:rPr>
         <w:t> </w:t>
       </w:r>
+      <w:proofErr w:type="gramStart"/>
       <w:r>
         <w:rPr>
           <w:spacing w:val="-2"/>
@@ -1567,6 +2054,7 @@
         </w:rPr>
         <w:t>☐</w:t>
       </w:r>
+      <w:proofErr w:type="gramEnd"/>
       <w:r>
         <w:rPr>
           <w:rFonts w:ascii="Times New Roman" w:hAnsi="Times New Roman"/>
@@ -1576,6 +2064,7 @@
         </w:rPr>
         <w:t> </w:t>
       </w:r>
+      <w:proofErr w:type="gramStart"/>
       <w:r>
         <w:rPr>
           <w:spacing w:val="-2"/>
@@ -1596,6 +2085,7 @@
         </w:rPr>
         <w:t>☐</w:t>
       </w:r>
+      <w:proofErr w:type="gramEnd"/>
       <w:r>
         <w:rPr>
           <w:rFonts w:ascii="Times New Roman" w:hAnsi="Times New Roman"/>
@@ -1914,6 +2404,7 @@
         </w:rPr>
         <w:t xml:space="preserve"> </w:t>
       </w:r>
+      <w:proofErr w:type="gramStart"/>
       <w:r>
         <w:rPr>
           <w:sz w:val="24"/>
@@ -1921,6 +2412,7 @@
         </w:rPr>
         <w:t>show</w:t>
       </w:r>
+      <w:proofErr w:type="gramEnd"/>
       <w:r>
         <w:rPr>
           <w:spacing w:val="-6"/>
@@ -2109,7 +2601,23 @@
           <w:sz w:val="24"/>
           <w:szCs w:val="24"/>
         </w:rPr>
-        <w:t>A rule will issue against {{capitalize(opponent_label)}} to show cause why they should not be held in contempt of Court for failure to ________________________________</w:t>
+        <w:t>A rule will issue against {{capitalize(</w:t>
+      </w:r>
+      <w:proofErr w:type="spellStart"/>
+      <w:r>
+        <w:rPr>
+          <w:sz w:val="24"/>
+          <w:szCs w:val="24"/>
+        </w:rPr>
+        <w:t>opponent_label</w:t>
+      </w:r>
+      <w:proofErr w:type="spellEnd"/>
+      <w:r>
+        <w:rPr>
+          <w:sz w:val="24"/>
+          <w:szCs w:val="24"/>
+        </w:rPr>
+        <w:t>)}} to show cause why they should not be held in contempt of Court for failure to ________________________________</w:t>
       </w:r>
       <w:r>
         <w:rPr>
@@ -2156,20 +2664,54 @@
           <w:szCs w:val="24"/>
         </w:rPr>
       </w:pPr>
-      <w:r>
-        <w:rPr>
-          <w:sz w:val="24"/>
-          <w:szCs w:val="24"/>
-        </w:rPr>
-        <w:t xml:space="preserve">2. {{capitalize(opponent_label)}} is ordered to appear on ______________ at </w:t>
-      </w:r>
+      <w:proofErr w:type="gramStart"/>
       <w:r>
         <w:rPr>
           <w:sz w:val="24"/>
           <w:szCs w:val="24"/>
         </w:rPr>
         <w:lastRenderedPageBreak/>
-        <w:t>_________ </w:t>
+        <w:t>2. {{capitalize</w:t>
+      </w:r>
+      <w:proofErr w:type="gramEnd"/>
+      <w:r>
+        <w:rPr>
+          <w:sz w:val="24"/>
+          <w:szCs w:val="24"/>
+        </w:rPr>
+        <w:t>(</w:t>
+      </w:r>
+      <w:proofErr w:type="spellStart"/>
+      <w:r>
+        <w:rPr>
+          <w:sz w:val="24"/>
+          <w:szCs w:val="24"/>
+        </w:rPr>
+        <w:t>opponent_</w:t>
+      </w:r>
+      <w:proofErr w:type="gramStart"/>
+      <w:r>
+        <w:rPr>
+          <w:sz w:val="24"/>
+          <w:szCs w:val="24"/>
+        </w:rPr>
+        <w:t>label</w:t>
+      </w:r>
+      <w:proofErr w:type="spellEnd"/>
+      <w:r>
+        <w:rPr>
+          <w:sz w:val="24"/>
+          <w:szCs w:val="24"/>
+        </w:rPr>
+        <w:t>)}}</w:t>
+      </w:r>
+      <w:proofErr w:type="gramEnd"/>
+      <w:r>
+        <w:rPr>
+          <w:sz w:val="24"/>
+          <w:szCs w:val="24"/>
+        </w:rPr>
+        <w:t xml:space="preserve"> is ordered to appear on ______________ at _________ </w:t>
       </w:r>
       <w:r>
         <w:rPr>
@@ -2301,14 +2843,7 @@
           <w:sz w:val="24"/>
           <w:szCs w:val="24"/>
         </w:rPr>
-        <w:t>Em</w:t>
-      </w:r>
-      <w:r>
-        <w:rPr>
-          <w:sz w:val="24"/>
-          <w:szCs w:val="24"/>
-        </w:rPr>
-        <w:t xml:space="preserve">ail </w:t>
+        <w:t xml:space="preserve">Email </w:t>
       </w:r>
       <w:r>
         <w:rPr>
@@ -2443,6 +2978,7 @@
         <w:ind w:right="115"/>
         <w:jc w:val="left"/>
       </w:pPr>
+      <w:bookmarkStart w:id="0" w:name="_Ref234420070"/>
       <w:r>
         <w:t>NOTICE: FAILURE TO APPEAR AS ORDERED BY THE COURT MAY RESULT IN A FINDING</w:t>
       </w:r>
@@ -2539,6 +3075,7 @@
       <w:r>
         <w:t>.</w:t>
       </w:r>
+      <w:bookmarkEnd w:id="0"/>
     </w:p>
     <w:p>
       <w:pPr>
@@ -2605,7 +3142,39 @@
                 <w:sz w:val="24"/>
                 <w:szCs w:val="24"/>
               </w:rPr>
-              <w:t>{{users[0].name_full()}}</w:t>
+              <w:t>{{users[0].</w:t>
+            </w:r>
+            <w:proofErr w:type="spellStart"/>
+            <w:r>
+              <w:rPr>
+                <w:sz w:val="24"/>
+                <w:szCs w:val="24"/>
+              </w:rPr>
+              <w:t>name_</w:t>
+            </w:r>
+            <w:proofErr w:type="gramStart"/>
+            <w:r>
+              <w:rPr>
+                <w:sz w:val="24"/>
+                <w:szCs w:val="24"/>
+              </w:rPr>
+              <w:t>full</w:t>
+            </w:r>
+            <w:proofErr w:type="spellEnd"/>
+            <w:r>
+              <w:rPr>
+                <w:sz w:val="24"/>
+                <w:szCs w:val="24"/>
+              </w:rPr>
+              <w:t>(</w:t>
+            </w:r>
+            <w:proofErr w:type="gramEnd"/>
+            <w:r>
+              <w:rPr>
+                <w:sz w:val="24"/>
+                <w:szCs w:val="24"/>
+              </w:rPr>
+              <w:t>)}}</w:t>
             </w:r>
           </w:p>
         </w:tc>
@@ -2821,7 +3390,39 @@
                 <w:sz w:val="24"/>
                 <w:szCs w:val="24"/>
               </w:rPr>
-              <w:t>{{users[0].address.on_one_line(bare=True)}}</w:t>
+              <w:t>{{users[0</w:t>
+            </w:r>
+            <w:proofErr w:type="gramStart"/>
+            <w:r>
+              <w:rPr>
+                <w:sz w:val="24"/>
+                <w:szCs w:val="24"/>
+              </w:rPr>
+              <w:t>].</w:t>
+            </w:r>
+            <w:proofErr w:type="spellStart"/>
+            <w:r>
+              <w:rPr>
+                <w:sz w:val="24"/>
+                <w:szCs w:val="24"/>
+              </w:rPr>
+              <w:t>address</w:t>
+            </w:r>
+            <w:proofErr w:type="gramEnd"/>
+            <w:r>
+              <w:rPr>
+                <w:sz w:val="24"/>
+                <w:szCs w:val="24"/>
+              </w:rPr>
+              <w:t>.on_one_line</w:t>
+            </w:r>
+            <w:proofErr w:type="spellEnd"/>
+            <w:r>
+              <w:rPr>
+                <w:sz w:val="24"/>
+                <w:szCs w:val="24"/>
+              </w:rPr>
+              <w:t>(bare=True)}}</w:t>
             </w:r>
           </w:p>
         </w:tc>
@@ -3037,7 +3638,151 @@
                 <w:sz w:val="24"/>
                 <w:szCs w:val="24"/>
               </w:rPr>
-              <w:t>{% if users[0].phone_number != “” %}{{phone_number_formatted(users[0].phone_number)}}{% endif %}</w:t>
+              <w:t xml:space="preserve">{% if </w:t>
+            </w:r>
+            <w:proofErr w:type="gramStart"/>
+            <w:r>
+              <w:rPr>
+                <w:sz w:val="24"/>
+                <w:szCs w:val="24"/>
+              </w:rPr>
+              <w:t>users[</w:t>
+            </w:r>
+            <w:proofErr w:type="gramEnd"/>
+            <w:r>
+              <w:rPr>
+                <w:sz w:val="24"/>
+                <w:szCs w:val="24"/>
+              </w:rPr>
+              <w:t>0</w:t>
+            </w:r>
+            <w:proofErr w:type="gramStart"/>
+            <w:r>
+              <w:rPr>
+                <w:sz w:val="24"/>
+                <w:szCs w:val="24"/>
+              </w:rPr>
+              <w:t>].</w:t>
+            </w:r>
+            <w:proofErr w:type="spellStart"/>
+            <w:r>
+              <w:rPr>
+                <w:sz w:val="24"/>
+                <w:szCs w:val="24"/>
+              </w:rPr>
+              <w:t>phone</w:t>
+            </w:r>
+            <w:proofErr w:type="gramEnd"/>
+            <w:r>
+              <w:rPr>
+                <w:sz w:val="24"/>
+                <w:szCs w:val="24"/>
+              </w:rPr>
+              <w:t>_</w:t>
+            </w:r>
+            <w:proofErr w:type="gramStart"/>
+            <w:r>
+              <w:rPr>
+                <w:sz w:val="24"/>
+                <w:szCs w:val="24"/>
+              </w:rPr>
+              <w:t>number</w:t>
+            </w:r>
+            <w:proofErr w:type="spellEnd"/>
+            <w:r>
+              <w:rPr>
+                <w:sz w:val="24"/>
+                <w:szCs w:val="24"/>
+              </w:rPr>
+              <w:t xml:space="preserve"> !</w:t>
+            </w:r>
+            <w:proofErr w:type="gramEnd"/>
+            <w:r>
+              <w:rPr>
+                <w:sz w:val="24"/>
+                <w:szCs w:val="24"/>
+              </w:rPr>
+              <w:t xml:space="preserve">= “” </w:t>
+            </w:r>
+            <w:proofErr w:type="gramStart"/>
+            <w:r>
+              <w:rPr>
+                <w:sz w:val="24"/>
+                <w:szCs w:val="24"/>
+              </w:rPr>
+              <w:t>%}{</w:t>
+            </w:r>
+            <w:proofErr w:type="gramEnd"/>
+            <w:r>
+              <w:rPr>
+                <w:sz w:val="24"/>
+                <w:szCs w:val="24"/>
+              </w:rPr>
+              <w:t>{</w:t>
+            </w:r>
+            <w:proofErr w:type="spellStart"/>
+            <w:r>
+              <w:rPr>
+                <w:sz w:val="24"/>
+                <w:szCs w:val="24"/>
+              </w:rPr>
+              <w:t>phone_number_formatted</w:t>
+            </w:r>
+            <w:proofErr w:type="spellEnd"/>
+            <w:r>
+              <w:rPr>
+                <w:sz w:val="24"/>
+                <w:szCs w:val="24"/>
+              </w:rPr>
+              <w:t>(users[0</w:t>
+            </w:r>
+            <w:proofErr w:type="gramStart"/>
+            <w:r>
+              <w:rPr>
+                <w:sz w:val="24"/>
+                <w:szCs w:val="24"/>
+              </w:rPr>
+              <w:t>].</w:t>
+            </w:r>
+            <w:proofErr w:type="spellStart"/>
+            <w:r>
+              <w:rPr>
+                <w:sz w:val="24"/>
+                <w:szCs w:val="24"/>
+              </w:rPr>
+              <w:t>phone</w:t>
+            </w:r>
+            <w:proofErr w:type="gramEnd"/>
+            <w:r>
+              <w:rPr>
+                <w:sz w:val="24"/>
+                <w:szCs w:val="24"/>
+              </w:rPr>
+              <w:t>_number</w:t>
+            </w:r>
+            <w:proofErr w:type="spellEnd"/>
+            <w:r>
+              <w:rPr>
+                <w:sz w:val="24"/>
+                <w:szCs w:val="24"/>
+              </w:rPr>
+              <w:t>)</w:t>
+            </w:r>
+            <w:proofErr w:type="gramStart"/>
+            <w:r>
+              <w:rPr>
+                <w:sz w:val="24"/>
+                <w:szCs w:val="24"/>
+              </w:rPr>
+              <w:t>}}{</w:t>
+            </w:r>
+            <w:proofErr w:type="gramEnd"/>
+            <w:r>
+              <w:rPr>
+                <w:sz w:val="24"/>
+                <w:szCs w:val="24"/>
+              </w:rPr>
+              <w:t>% endif %}</w:t>
             </w:r>
           </w:p>
         </w:tc>
@@ -3253,21 +3998,101 @@
                 <w:sz w:val="24"/>
                 <w:szCs w:val="24"/>
               </w:rPr>
-              <w:t>{% if users[0].has_email_address %}</w:t>
-            </w:r>
-            <w:r>
-              <w:rPr>
-                <w:sz w:val="24"/>
-                <w:szCs w:val="24"/>
-              </w:rPr>
-              <w:t>{{users[0].email}}</w:t>
-            </w:r>
-            <w:r>
-              <w:rPr>
-                <w:sz w:val="24"/>
-                <w:szCs w:val="24"/>
-              </w:rPr>
-              <w:t>{% endif %}</w:t>
+              <w:t xml:space="preserve">{% if </w:t>
+            </w:r>
+            <w:proofErr w:type="gramStart"/>
+            <w:r>
+              <w:rPr>
+                <w:sz w:val="24"/>
+                <w:szCs w:val="24"/>
+              </w:rPr>
+              <w:t>users[</w:t>
+            </w:r>
+            <w:proofErr w:type="gramEnd"/>
+            <w:r>
+              <w:rPr>
+                <w:sz w:val="24"/>
+                <w:szCs w:val="24"/>
+              </w:rPr>
+              <w:t>0</w:t>
+            </w:r>
+            <w:proofErr w:type="gramStart"/>
+            <w:r>
+              <w:rPr>
+                <w:sz w:val="24"/>
+                <w:szCs w:val="24"/>
+              </w:rPr>
+              <w:t>].</w:t>
+            </w:r>
+            <w:proofErr w:type="spellStart"/>
+            <w:r>
+              <w:rPr>
+                <w:sz w:val="24"/>
+                <w:szCs w:val="24"/>
+              </w:rPr>
+              <w:t>has</w:t>
+            </w:r>
+            <w:proofErr w:type="gramEnd"/>
+            <w:r>
+              <w:rPr>
+                <w:sz w:val="24"/>
+                <w:szCs w:val="24"/>
+              </w:rPr>
+              <w:t>_email_address</w:t>
+            </w:r>
+            <w:proofErr w:type="spellEnd"/>
+            <w:r>
+              <w:rPr>
+                <w:sz w:val="24"/>
+                <w:szCs w:val="24"/>
+              </w:rPr>
+              <w:t xml:space="preserve"> </w:t>
+            </w:r>
+            <w:proofErr w:type="gramStart"/>
+            <w:r>
+              <w:rPr>
+                <w:sz w:val="24"/>
+                <w:szCs w:val="24"/>
+              </w:rPr>
+              <w:t>%}</w:t>
+            </w:r>
+            <w:r>
+              <w:rPr>
+                <w:sz w:val="24"/>
+                <w:szCs w:val="24"/>
+              </w:rPr>
+              <w:t>{</w:t>
+            </w:r>
+            <w:proofErr w:type="gramEnd"/>
+            <w:r>
+              <w:rPr>
+                <w:sz w:val="24"/>
+                <w:szCs w:val="24"/>
+              </w:rPr>
+              <w:t>{users[0</w:t>
+            </w:r>
+            <w:proofErr w:type="gramStart"/>
+            <w:r>
+              <w:rPr>
+                <w:sz w:val="24"/>
+                <w:szCs w:val="24"/>
+              </w:rPr>
+              <w:t>].email}}</w:t>
+            </w:r>
+            <w:r>
+              <w:rPr>
+                <w:sz w:val="24"/>
+                <w:szCs w:val="24"/>
+              </w:rPr>
+              <w:t>{</w:t>
+            </w:r>
+            <w:proofErr w:type="gramEnd"/>
+            <w:r>
+              <w:rPr>
+                <w:sz w:val="24"/>
+                <w:szCs w:val="24"/>
+              </w:rPr>
+              <w:t>% endif %}</w:t>
             </w:r>
           </w:p>
         </w:tc>
@@ -3398,7 +4223,12 @@
       </w:pPr>
     </w:p>
     <w:sectPr>
-      <w:footerReference w:type="default" r:id="rId7"/>
+      <w:headerReference w:type="even" r:id="rId7"/>
+      <w:headerReference w:type="default" r:id="rId8"/>
+      <w:footerReference w:type="even" r:id="rId9"/>
+      <w:footerReference w:type="default" r:id="rId10"/>
+      <w:headerReference w:type="first" r:id="rId11"/>
+      <w:footerReference w:type="first" r:id="rId12"/>
       <w:pgSz w:w="12240" w:h="15840"/>
       <w:pgMar w:top="1820" w:right="1440" w:bottom="1220" w:left="1080" w:header="0" w:footer="1037" w:gutter="0"/>
       <w:cols w:space="720"/>
@@ -3430,142 +4260,117 @@
 <w:ftr xmlns:wpc="http://schemas.microsoft.com/office/word/2010/wordprocessingCanvas" xmlns:cx="http://schemas.microsoft.com/office/drawing/2014/chartex" xmlns:cx1="http://schemas.microsoft.com/office/drawing/2015/9/8/chartex" xmlns:cx2="http://schemas.microsoft.com/office/drawing/2015/10/21/chartex" xmlns:cx3="http://schemas.microsoft.com/office/drawing/2016/5/9/chartex" xmlns:cx4="http://schemas.microsoft.com/office/drawing/2016/5/10/chartex" xmlns:cx5="http://schemas.microsoft.com/office/drawing/2016/5/11/chartex" xmlns:cx6="http://schemas.microsoft.com/office/drawing/2016/5/12/chartex" xmlns:cx7="http://schemas.microsoft.com/office/drawing/2016/5/13/chartex" xmlns:cx8="http://schemas.microsoft.com/office/drawing/2016/5/14/chartex" xmlns:mc="http://schemas.openxmlformats.org/markup-compatibility/2006" xmlns:aink="http://schemas.microsoft.com/office/drawing/2016/ink" xmlns:am3d="http://schemas.microsoft.com/office/drawing/2017/model3d" xmlns:o="urn:schemas-microsoft-com:office:office" xmlns:oel="http://schemas.microsoft.com/office/2019/extlst" xmlns:r="http://schemas.openxmlformats.org/officeDocument/2006/relationships" xmlns:m="http://schemas.openxmlformats.org/officeDocument/2006/math" xmlns:v="urn:schemas-microsoft-com:vml" xmlns:wp14="http://schemas.microsoft.com/office/word/2010/wordprocessingDrawing" xmlns:wp="http://schemas.openxmlformats.org/drawingml/2006/wordprocessingDrawing" xmlns:w10="urn:schemas-microsoft-com:office:word" xmlns:w="http://schemas.openxmlformats.org/wordprocessingml/2006/main" xmlns:w14="http://schemas.microsoft.com/office/word/2010/wordml" xmlns:w15="http://schemas.microsoft.com/office/word/2012/wordml" xmlns:w16cex="http://schemas.microsoft.com/office/word/2018/wordml/cex" xmlns:w16cid="http://schemas.microsoft.com/office/word/2016/wordml/cid" xmlns:w16="http://schemas.microsoft.com/office/word/2018/wordml" xmlns:w16du="http://schemas.microsoft.com/office/word/2023/wordml/word16du" xmlns:w16sdtdh="http://schemas.microsoft.com/office/word/2020/wordml/sdtdatahash" xmlns:w16sdtfl="http://schemas.microsoft.com/office/word/2024/wordml/sdtformatlock" xmlns:w16se="http://schemas.microsoft.com/office/word/2015/wordml/symex" xmlns:wpg="http://schemas.microsoft.com/office/word/2010/wordprocessingGroup" xmlns:wpi="http://schemas.microsoft.com/office/word/2010/wordprocessingInk" xmlns:wne="http://schemas.microsoft.com/office/word/2006/wordml" xmlns:wps="http://schemas.microsoft.com/office/word/2010/wordprocessingShape" mc:Ignorable="w14 w15 w16se w16cid w16 w16cex w16sdtdh w16sdtfl w16du wp14">
   <w:p>
     <w:pPr>
+      <w:pStyle w:val="Footer"/>
+    </w:pPr>
+  </w:p>
+</w:ftr>
+</file>
+
+<file path=word/footer2.xml><?xml version="1.0" encoding="utf-8"?>
+<w:ftr xmlns:wpc="http://schemas.microsoft.com/office/word/2010/wordprocessingCanvas" xmlns:cx="http://schemas.microsoft.com/office/drawing/2014/chartex" xmlns:cx1="http://schemas.microsoft.com/office/drawing/2015/9/8/chartex" xmlns:cx2="http://schemas.microsoft.com/office/drawing/2015/10/21/chartex" xmlns:cx3="http://schemas.microsoft.com/office/drawing/2016/5/9/chartex" xmlns:cx4="http://schemas.microsoft.com/office/drawing/2016/5/10/chartex" xmlns:cx5="http://schemas.microsoft.com/office/drawing/2016/5/11/chartex" xmlns:cx6="http://schemas.microsoft.com/office/drawing/2016/5/12/chartex" xmlns:cx7="http://schemas.microsoft.com/office/drawing/2016/5/13/chartex" xmlns:cx8="http://schemas.microsoft.com/office/drawing/2016/5/14/chartex" xmlns:mc="http://schemas.openxmlformats.org/markup-compatibility/2006" xmlns:aink="http://schemas.microsoft.com/office/drawing/2016/ink" xmlns:am3d="http://schemas.microsoft.com/office/drawing/2017/model3d" xmlns:o="urn:schemas-microsoft-com:office:office" xmlns:oel="http://schemas.microsoft.com/office/2019/extlst" xmlns:r="http://schemas.openxmlformats.org/officeDocument/2006/relationships" xmlns:m="http://schemas.openxmlformats.org/officeDocument/2006/math" xmlns:v="urn:schemas-microsoft-com:vml" xmlns:wp14="http://schemas.microsoft.com/office/word/2010/wordprocessingDrawing" xmlns:wp="http://schemas.openxmlformats.org/drawingml/2006/wordprocessingDrawing" xmlns:w10="urn:schemas-microsoft-com:office:word" xmlns:w="http://schemas.openxmlformats.org/wordprocessingml/2006/main" xmlns:w14="http://schemas.microsoft.com/office/word/2010/wordml" xmlns:w15="http://schemas.microsoft.com/office/word/2012/wordml" xmlns:w16cex="http://schemas.microsoft.com/office/word/2018/wordml/cex" xmlns:w16cid="http://schemas.microsoft.com/office/word/2016/wordml/cid" xmlns:w16="http://schemas.microsoft.com/office/word/2018/wordml" xmlns:w16du="http://schemas.microsoft.com/office/word/2023/wordml/word16du" xmlns:w16sdtdh="http://schemas.microsoft.com/office/word/2020/wordml/sdtdatahash" xmlns:w16sdtfl="http://schemas.microsoft.com/office/word/2024/wordml/sdtformatlock" xmlns:w16se="http://schemas.microsoft.com/office/word/2015/wordml/symex" xmlns:wpg="http://schemas.microsoft.com/office/word/2010/wordprocessingGroup" xmlns:wpi="http://schemas.microsoft.com/office/word/2010/wordprocessingInk" xmlns:wne="http://schemas.microsoft.com/office/word/2006/wordml" xmlns:wps="http://schemas.microsoft.com/office/word/2010/wordprocessingShape" mc:Ignorable="w14 w15 w16se w16cid w16 w16cex w16sdtdh w16sdtfl w16du wp14">
+  <w:sdt>
+    <w:sdtPr>
+      <w:id w:val="-709035495"/>
+      <w:docPartObj>
+        <w:docPartGallery w:val="Page Numbers (Bottom of Page)"/>
+        <w:docPartUnique/>
+      </w:docPartObj>
+    </w:sdtPr>
+    <w:sdtEndPr>
+      <w:rPr>
+        <w:noProof/>
+      </w:rPr>
+    </w:sdtEndPr>
+    <w:sdtContent>
+      <w:p>
+        <w:pPr>
+          <w:pStyle w:val="Footer"/>
+          <w:jc w:val="center"/>
+        </w:pPr>
+        <w:r>
+          <w:fldChar w:fldCharType="begin"/>
+        </w:r>
+        <w:r>
+          <w:instrText xml:space="preserve"> PAGE   \* MERGEFORMAT </w:instrText>
+        </w:r>
+        <w:r>
+          <w:fldChar w:fldCharType="separate"/>
+        </w:r>
+        <w:r>
+          <w:rPr>
+            <w:noProof/>
+          </w:rPr>
+          <w:t>2</w:t>
+        </w:r>
+        <w:r>
+          <w:rPr>
+            <w:noProof/>
+          </w:rPr>
+          <w:fldChar w:fldCharType="end"/>
+        </w:r>
+        <w:r>
+          <w:rPr>
+            <w:noProof/>
+          </w:rPr>
+          <w:t xml:space="preserve"> o</w:t>
+        </w:r>
+        <w:r>
+          <w:rPr>
+            <w:noProof/>
+          </w:rPr>
+          <w:t xml:space="preserve">f </w:t>
+        </w:r>
+        <w:r>
+          <w:rPr>
+            <w:noProof/>
+          </w:rPr>
+          <w:fldChar w:fldCharType="begin"/>
+        </w:r>
+        <w:r>
+          <w:rPr>
+            <w:noProof/>
+          </w:rPr>
+          <w:instrText xml:space="preserve"> PAGEREF _Ref234420070 </w:instrText>
+        </w:r>
+        <w:r>
+          <w:rPr>
+            <w:noProof/>
+          </w:rPr>
+          <w:fldChar w:fldCharType="separate"/>
+        </w:r>
+        <w:r>
+          <w:rPr>
+            <w:noProof/>
+          </w:rPr>
+          <w:t>2</w:t>
+        </w:r>
+        <w:r>
+          <w:rPr>
+            <w:noProof/>
+          </w:rPr>
+          <w:fldChar w:fldCharType="end"/>
+        </w:r>
+      </w:p>
+    </w:sdtContent>
+  </w:sdt>
+  <w:p>
+    <w:pPr>
       <w:pStyle w:val="BodyText"/>
       <w:spacing w:line="14" w:lineRule="auto"/>
       <w:rPr>
         <w:sz w:val="20"/>
       </w:rPr>
     </w:pPr>
-    <w:r>
-      <w:rPr>
-        <w:noProof/>
-        <w:sz w:val="20"/>
-      </w:rPr>
-      <mc:AlternateContent>
-        <mc:Choice Requires="wps">
-          <w:drawing>
-            <wp:anchor distT="0" distB="0" distL="0" distR="0" simplePos="0" relativeHeight="487518720" behindDoc="1" locked="0" layoutInCell="1" allowOverlap="1" wp14:anchorId="7EC66E44" wp14:editId="1D811826">
-              <wp:simplePos x="0" y="0"/>
-              <wp:positionH relativeFrom="page">
-                <wp:posOffset>3698240</wp:posOffset>
-              </wp:positionH>
-              <wp:positionV relativeFrom="page">
-                <wp:posOffset>9260331</wp:posOffset>
-              </wp:positionV>
-              <wp:extent cx="375285" cy="181610"/>
-              <wp:effectExtent l="0" t="0" r="0" b="0"/>
-              <wp:wrapNone/>
-              <wp:docPr id="19" name="Textbox 19"/>
-              <wp:cNvGraphicFramePr>
-                <a:graphicFrameLocks xmlns:a="http://schemas.openxmlformats.org/drawingml/2006/main"/>
-              </wp:cNvGraphicFramePr>
-              <a:graphic xmlns:a="http://schemas.openxmlformats.org/drawingml/2006/main">
-                <a:graphicData uri="http://schemas.microsoft.com/office/word/2010/wordprocessingShape">
-                  <wps:wsp>
-                    <wps:cNvSpPr txBox="1">
-                      <a:spLocks/>
-                    </wps:cNvSpPr>
-                    <wps:spPr>
-                      <a:xfrm>
-                        <a:off x="0" y="0"/>
-                        <a:ext cx="375285" cy="181610"/>
-                      </a:xfrm>
-                      <a:prstGeom prst="rect">
-                        <a:avLst/>
-                      </a:prstGeom>
-                    </wps:spPr>
-                    <wps:txbx>
-                      <w:txbxContent>
-                        <w:p>
-                          <w:pPr>
-                            <w:pStyle w:val="BodyText"/>
-                            <w:spacing w:before="12"/>
-                            <w:ind w:left="20"/>
-                          </w:pPr>
-                          <w:r>
-                            <w:t>2</w:t>
-                          </w:r>
-                          <w:r>
-                            <w:rPr>
-                              <w:spacing w:val="-2"/>
-                            </w:rPr>
-                            <w:t xml:space="preserve"> </w:t>
-                          </w:r>
-                          <w:r>
-                            <w:t>of</w:t>
-                          </w:r>
-                          <w:r>
-                            <w:rPr>
-                              <w:spacing w:val="-2"/>
-                            </w:rPr>
-                            <w:t xml:space="preserve"> </w:t>
-                          </w:r>
-                          <w:r>
-                            <w:rPr>
-                              <w:spacing w:val="-10"/>
-                            </w:rPr>
-                            <w:t>2</w:t>
-                          </w:r>
-                        </w:p>
-                      </w:txbxContent>
-                    </wps:txbx>
-                    <wps:bodyPr wrap="square" lIns="0" tIns="0" rIns="0" bIns="0" rtlCol="0">
-                      <a:noAutofit/>
-                    </wps:bodyPr>
-                  </wps:wsp>
-                </a:graphicData>
-              </a:graphic>
-            </wp:anchor>
-          </w:drawing>
-        </mc:Choice>
-        <mc:Fallback>
-          <w:pict>
-            <v:shapetype w14:anchorId="7EC66E44" id="_x0000_t202" coordsize="21600,21600" o:spt="202" path="m,l,21600r21600,l21600,xe">
-              <v:stroke joinstyle="miter"/>
-              <v:path gradientshapeok="t" o:connecttype="rect"/>
-            </v:shapetype>
-            <v:shape id="Textbox 19" o:spid="_x0000_s1026" type="#_x0000_t202" style="position:absolute;margin-left:291.2pt;margin-top:729.15pt;width:29.55pt;height:14.3pt;z-index:-15797760;visibility:visible;mso-wrap-style:square;mso-wrap-distance-left:0;mso-wrap-distance-top:0;mso-wrap-distance-right:0;mso-wrap-distance-bottom:0;mso-position-horizontal:absolute;mso-position-horizontal-relative:page;mso-position-vertical:absolute;mso-position-vertical-relative:page;v-text-anchor:top" o:gfxdata="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" filled="f" stroked="f">
-              <v:textbox inset="0,0,0,0">
-                <w:txbxContent>
-                  <w:p>
-                    <w:pPr>
-                      <w:pStyle w:val="BodyText"/>
-                      <w:spacing w:before="12"/>
-                      <w:ind w:left="20"/>
-                    </w:pPr>
-                    <w:r>
-                      <w:t>2</w:t>
-                    </w:r>
-                    <w:r>
-                      <w:rPr>
-                        <w:spacing w:val="-2"/>
-                      </w:rPr>
-                      <w:t xml:space="preserve"> </w:t>
-                    </w:r>
-                    <w:r>
-                      <w:t>of</w:t>
-                    </w:r>
-                    <w:r>
-                      <w:rPr>
-                        <w:spacing w:val="-2"/>
-                      </w:rPr>
-                      <w:t xml:space="preserve"> </w:t>
-                    </w:r>
-                    <w:r>
-                      <w:rPr>
-                        <w:spacing w:val="-10"/>
-                      </w:rPr>
-                      <w:t>2</w:t>
-                    </w:r>
-                  </w:p>
-                </w:txbxContent>
-              </v:textbox>
-              <w10:wrap anchorx="page" anchory="page"/>
-            </v:shape>
-          </w:pict>
-        </mc:Fallback>
-      </mc:AlternateContent>
-    </w:r>
+  </w:p>
+</w:ftr>
+</file>
+
+<file path=word/footer3.xml><?xml version="1.0" encoding="utf-8"?>
+<w:ftr xmlns:wpc="http://schemas.microsoft.com/office/word/2010/wordprocessingCanvas" xmlns:cx="http://schemas.microsoft.com/office/drawing/2014/chartex" xmlns:cx1="http://schemas.microsoft.com/office/drawing/2015/9/8/chartex" xmlns:cx2="http://schemas.microsoft.com/office/drawing/2015/10/21/chartex" xmlns:cx3="http://schemas.microsoft.com/office/drawing/2016/5/9/chartex" xmlns:cx4="http://schemas.microsoft.com/office/drawing/2016/5/10/chartex" xmlns:cx5="http://schemas.microsoft.com/office/drawing/2016/5/11/chartex" xmlns:cx6="http://schemas.microsoft.com/office/drawing/2016/5/12/chartex" xmlns:cx7="http://schemas.microsoft.com/office/drawing/2016/5/13/chartex" xmlns:cx8="http://schemas.microsoft.com/office/drawing/2016/5/14/chartex" xmlns:mc="http://schemas.openxmlformats.org/markup-compatibility/2006" xmlns:aink="http://schemas.microsoft.com/office/drawing/2016/ink" xmlns:am3d="http://schemas.microsoft.com/office/drawing/2017/model3d" xmlns:o="urn:schemas-microsoft-com:office:office" xmlns:oel="http://schemas.microsoft.com/office/2019/extlst" xmlns:r="http://schemas.openxmlformats.org/officeDocument/2006/relationships" xmlns:m="http://schemas.openxmlformats.org/officeDocument/2006/math" xmlns:v="urn:schemas-microsoft-com:vml" xmlns:wp14="http://schemas.microsoft.com/office/word/2010/wordprocessingDrawing" xmlns:wp="http://schemas.openxmlformats.org/drawingml/2006/wordprocessingDrawing" xmlns:w10="urn:schemas-microsoft-com:office:word" xmlns:w="http://schemas.openxmlformats.org/wordprocessingml/2006/main" xmlns:w14="http://schemas.microsoft.com/office/word/2010/wordml" xmlns:w15="http://schemas.microsoft.com/office/word/2012/wordml" xmlns:w16cex="http://schemas.microsoft.com/office/word/2018/wordml/cex" xmlns:w16cid="http://schemas.microsoft.com/office/word/2016/wordml/cid" xmlns:w16="http://schemas.microsoft.com/office/word/2018/wordml" xmlns:w16du="http://schemas.microsoft.com/office/word/2023/wordml/word16du" xmlns:w16sdtdh="http://schemas.microsoft.com/office/word/2020/wordml/sdtdatahash" xmlns:w16sdtfl="http://schemas.microsoft.com/office/word/2024/wordml/sdtformatlock" xmlns:w16se="http://schemas.microsoft.com/office/word/2015/wordml/symex" xmlns:wpg="http://schemas.microsoft.com/office/word/2010/wordprocessingGroup" xmlns:wpi="http://schemas.microsoft.com/office/word/2010/wordprocessingInk" xmlns:wne="http://schemas.microsoft.com/office/word/2006/wordml" xmlns:wps="http://schemas.microsoft.com/office/word/2010/wordprocessingShape" mc:Ignorable="w14 w15 w16se w16cid w16 w16cex w16sdtdh w16sdtfl w16du wp14">
+  <w:p>
+    <w:pPr>
+      <w:pStyle w:val="Footer"/>
+    </w:pPr>
   </w:p>
 </w:ftr>
 </file>
@@ -3587,6 +4392,36 @@
     </w:p>
   </w:footnote>
 </w:footnotes>
+</file>
+
+<file path=word/header1.xml><?xml version="1.0" encoding="utf-8"?>
+<w:hdr xmlns:wpc="http://schemas.microsoft.com/office/word/2010/wordprocessingCanvas" xmlns:cx="http://schemas.microsoft.com/office/drawing/2014/chartex" xmlns:cx1="http://schemas.microsoft.com/office/drawing/2015/9/8/chartex" xmlns:cx2="http://schemas.microsoft.com/office/drawing/2015/10/21/chartex" xmlns:cx3="http://schemas.microsoft.com/office/drawing/2016/5/9/chartex" xmlns:cx4="http://schemas.microsoft.com/office/drawing/2016/5/10/chartex" xmlns:cx5="http://schemas.microsoft.com/office/drawing/2016/5/11/chartex" xmlns:cx6="http://schemas.microsoft.com/office/drawing/2016/5/12/chartex" xmlns:cx7="http://schemas.microsoft.com/office/drawing/2016/5/13/chartex" xmlns:cx8="http://schemas.microsoft.com/office/drawing/2016/5/14/chartex" xmlns:mc="http://schemas.openxmlformats.org/markup-compatibility/2006" xmlns:aink="http://schemas.microsoft.com/office/drawing/2016/ink" xmlns:am3d="http://schemas.microsoft.com/office/drawing/2017/model3d" xmlns:o="urn:schemas-microsoft-com:office:office" xmlns:oel="http://schemas.microsoft.com/office/2019/extlst" xmlns:r="http://schemas.openxmlformats.org/officeDocument/2006/relationships" xmlns:m="http://schemas.openxmlformats.org/officeDocument/2006/math" xmlns:v="urn:schemas-microsoft-com:vml" xmlns:wp14="http://schemas.microsoft.com/office/word/2010/wordprocessingDrawing" xmlns:wp="http://schemas.openxmlformats.org/drawingml/2006/wordprocessingDrawing" xmlns:w10="urn:schemas-microsoft-com:office:word" xmlns:w="http://schemas.openxmlformats.org/wordprocessingml/2006/main" xmlns:w14="http://schemas.microsoft.com/office/word/2010/wordml" xmlns:w15="http://schemas.microsoft.com/office/word/2012/wordml" xmlns:w16cex="http://schemas.microsoft.com/office/word/2018/wordml/cex" xmlns:w16cid="http://schemas.microsoft.com/office/word/2016/wordml/cid" xmlns:w16="http://schemas.microsoft.com/office/word/2018/wordml" xmlns:w16du="http://schemas.microsoft.com/office/word/2023/wordml/word16du" xmlns:w16sdtdh="http://schemas.microsoft.com/office/word/2020/wordml/sdtdatahash" xmlns:w16sdtfl="http://schemas.microsoft.com/office/word/2024/wordml/sdtformatlock" xmlns:w16se="http://schemas.microsoft.com/office/word/2015/wordml/symex" xmlns:wpg="http://schemas.microsoft.com/office/word/2010/wordprocessingGroup" xmlns:wpi="http://schemas.microsoft.com/office/word/2010/wordprocessingInk" xmlns:wne="http://schemas.microsoft.com/office/word/2006/wordml" xmlns:wps="http://schemas.microsoft.com/office/word/2010/wordprocessingShape" mc:Ignorable="w14 w15 w16se w16cid w16 w16cex w16sdtdh w16sdtfl w16du wp14">
+  <w:p>
+    <w:pPr>
+      <w:pStyle w:val="Header"/>
+    </w:pPr>
+  </w:p>
+</w:hdr>
+</file>
+
+<file path=word/header2.xml><?xml version="1.0" encoding="utf-8"?>
+<w:hdr xmlns:wpc="http://schemas.microsoft.com/office/word/2010/wordprocessingCanvas" xmlns:cx="http://schemas.microsoft.com/office/drawing/2014/chartex" xmlns:cx1="http://schemas.microsoft.com/office/drawing/2015/9/8/chartex" xmlns:cx2="http://schemas.microsoft.com/office/drawing/2015/10/21/chartex" xmlns:cx3="http://schemas.microsoft.com/office/drawing/2016/5/9/chartex" xmlns:cx4="http://schemas.microsoft.com/office/drawing/2016/5/10/chartex" xmlns:cx5="http://schemas.microsoft.com/office/drawing/2016/5/11/chartex" xmlns:cx6="http://schemas.microsoft.com/office/drawing/2016/5/12/chartex" xmlns:cx7="http://schemas.microsoft.com/office/drawing/2016/5/13/chartex" xmlns:cx8="http://schemas.microsoft.com/office/drawing/2016/5/14/chartex" xmlns:mc="http://schemas.openxmlformats.org/markup-compatibility/2006" xmlns:aink="http://schemas.microsoft.com/office/drawing/2016/ink" xmlns:am3d="http://schemas.microsoft.com/office/drawing/2017/model3d" xmlns:o="urn:schemas-microsoft-com:office:office" xmlns:oel="http://schemas.microsoft.com/office/2019/extlst" xmlns:r="http://schemas.openxmlformats.org/officeDocument/2006/relationships" xmlns:m="http://schemas.openxmlformats.org/officeDocument/2006/math" xmlns:v="urn:schemas-microsoft-com:vml" xmlns:wp14="http://schemas.microsoft.com/office/word/2010/wordprocessingDrawing" xmlns:wp="http://schemas.openxmlformats.org/drawingml/2006/wordprocessingDrawing" xmlns:w10="urn:schemas-microsoft-com:office:word" xmlns:w="http://schemas.openxmlformats.org/wordprocessingml/2006/main" xmlns:w14="http://schemas.microsoft.com/office/word/2010/wordml" xmlns:w15="http://schemas.microsoft.com/office/word/2012/wordml" xmlns:w16cex="http://schemas.microsoft.com/office/word/2018/wordml/cex" xmlns:w16cid="http://schemas.microsoft.com/office/word/2016/wordml/cid" xmlns:w16="http://schemas.microsoft.com/office/word/2018/wordml" xmlns:w16du="http://schemas.microsoft.com/office/word/2023/wordml/word16du" xmlns:w16sdtdh="http://schemas.microsoft.com/office/word/2020/wordml/sdtdatahash" xmlns:w16sdtfl="http://schemas.microsoft.com/office/word/2024/wordml/sdtformatlock" xmlns:w16se="http://schemas.microsoft.com/office/word/2015/wordml/symex" xmlns:wpg="http://schemas.microsoft.com/office/word/2010/wordprocessingGroup" xmlns:wpi="http://schemas.microsoft.com/office/word/2010/wordprocessingInk" xmlns:wne="http://schemas.microsoft.com/office/word/2006/wordml" xmlns:wps="http://schemas.microsoft.com/office/word/2010/wordprocessingShape" mc:Ignorable="w14 w15 w16se w16cid w16 w16cex w16sdtdh w16sdtfl w16du wp14">
+  <w:p>
+    <w:pPr>
+      <w:pStyle w:val="Header"/>
+    </w:pPr>
+  </w:p>
+</w:hdr>
+</file>
+
+<file path=word/header3.xml><?xml version="1.0" encoding="utf-8"?>
+<w:hdr xmlns:wpc="http://schemas.microsoft.com/office/word/2010/wordprocessingCanvas" xmlns:cx="http://schemas.microsoft.com/office/drawing/2014/chartex" xmlns:cx1="http://schemas.microsoft.com/office/drawing/2015/9/8/chartex" xmlns:cx2="http://schemas.microsoft.com/office/drawing/2015/10/21/chartex" xmlns:cx3="http://schemas.microsoft.com/office/drawing/2016/5/9/chartex" xmlns:cx4="http://schemas.microsoft.com/office/drawing/2016/5/10/chartex" xmlns:cx5="http://schemas.microsoft.com/office/drawing/2016/5/11/chartex" xmlns:cx6="http://schemas.microsoft.com/office/drawing/2016/5/12/chartex" xmlns:cx7="http://schemas.microsoft.com/office/drawing/2016/5/13/chartex" xmlns:cx8="http://schemas.microsoft.com/office/drawing/2016/5/14/chartex" xmlns:mc="http://schemas.openxmlformats.org/markup-compatibility/2006" xmlns:aink="http://schemas.microsoft.com/office/drawing/2016/ink" xmlns:am3d="http://schemas.microsoft.com/office/drawing/2017/model3d" xmlns:o="urn:schemas-microsoft-com:office:office" xmlns:oel="http://schemas.microsoft.com/office/2019/extlst" xmlns:r="http://schemas.openxmlformats.org/officeDocument/2006/relationships" xmlns:m="http://schemas.openxmlformats.org/officeDocument/2006/math" xmlns:v="urn:schemas-microsoft-com:vml" xmlns:wp14="http://schemas.microsoft.com/office/word/2010/wordprocessingDrawing" xmlns:wp="http://schemas.openxmlformats.org/drawingml/2006/wordprocessingDrawing" xmlns:w10="urn:schemas-microsoft-com:office:word" xmlns:w="http://schemas.openxmlformats.org/wordprocessingml/2006/main" xmlns:w14="http://schemas.microsoft.com/office/word/2010/wordml" xmlns:w15="http://schemas.microsoft.com/office/word/2012/wordml" xmlns:w16cex="http://schemas.microsoft.com/office/word/2018/wordml/cex" xmlns:w16cid="http://schemas.microsoft.com/office/word/2016/wordml/cid" xmlns:w16="http://schemas.microsoft.com/office/word/2018/wordml" xmlns:w16du="http://schemas.microsoft.com/office/word/2023/wordml/word16du" xmlns:w16sdtdh="http://schemas.microsoft.com/office/word/2020/wordml/sdtdatahash" xmlns:w16sdtfl="http://schemas.microsoft.com/office/word/2024/wordml/sdtformatlock" xmlns:w16se="http://schemas.microsoft.com/office/word/2015/wordml/symex" xmlns:wpg="http://schemas.microsoft.com/office/word/2010/wordprocessingGroup" xmlns:wpi="http://schemas.microsoft.com/office/word/2010/wordprocessingInk" xmlns:wne="http://schemas.microsoft.com/office/word/2006/wordml" xmlns:wps="http://schemas.microsoft.com/office/word/2010/wordprocessingShape" mc:Ignorable="w14 w15 w16se w16cid w16 w16cex w16sdtdh w16sdtfl w16du wp14">
+  <w:p>
+    <w:pPr>
+      <w:pStyle w:val="Header"/>
+    </w:pPr>
+  </w:p>
+</w:hdr>
 </file>
 
 <file path=word/numbering.xml><?xml version="1.0" encoding="utf-8"?>
@@ -4294,6 +5129,54 @@
       </w:tblBorders>
     </w:tblPr>
   </w:style>
+  <w:style w:type="paragraph" w:styleId="Header">
+    <w:name w:val="header"/>
+    <w:basedOn w:val="Normal"/>
+    <w:link w:val="HeaderChar"/>
+    <w:uiPriority w:val="99"/>
+    <w:unhideWhenUsed/>
+    <w:rsid w:val="006B2DD0"/>
+    <w:pPr>
+      <w:tabs>
+        <w:tab w:val="center" w:pos="4680"/>
+        <w:tab w:val="right" w:pos="9360"/>
+      </w:tabs>
+    </w:pPr>
+  </w:style>
+  <w:style w:type="character" w:customStyle="1" w:styleId="HeaderChar">
+    <w:name w:val="Header Char"/>
+    <w:basedOn w:val="DefaultParagraphFont"/>
+    <w:link w:val="Header"/>
+    <w:uiPriority w:val="99"/>
+    <w:rsid w:val="006B2DD0"/>
+    <w:rPr>
+      <w:rFonts w:ascii="Arial" w:eastAsia="Arial" w:hAnsi="Arial" w:cs="Arial"/>
+    </w:rPr>
+  </w:style>
+  <w:style w:type="paragraph" w:styleId="Footer">
+    <w:name w:val="footer"/>
+    <w:basedOn w:val="Normal"/>
+    <w:link w:val="FooterChar"/>
+    <w:uiPriority w:val="99"/>
+    <w:unhideWhenUsed/>
+    <w:rsid w:val="006B2DD0"/>
+    <w:pPr>
+      <w:tabs>
+        <w:tab w:val="center" w:pos="4680"/>
+        <w:tab w:val="right" w:pos="9360"/>
+      </w:tabs>
+    </w:pPr>
+  </w:style>
+  <w:style w:type="character" w:customStyle="1" w:styleId="FooterChar">
+    <w:name w:val="Footer Char"/>
+    <w:basedOn w:val="DefaultParagraphFont"/>
+    <w:link w:val="Footer"/>
+    <w:uiPriority w:val="99"/>
+    <w:rsid w:val="006B2DD0"/>
+    <w:rPr>
+      <w:rFonts w:ascii="Arial" w:eastAsia="Arial" w:hAnsi="Arial" w:cs="Arial"/>
+    </w:rPr>
+  </w:style>
 </w:styles>
 </file>
 

</xml_diff>

<commit_message>
Implemented July 10 2026 feedback
</commit_message>
<xml_diff>
--- a/docassemble/PetitionForRuleToShowCauseFamily/data/templates/order_rule_family.docx
+++ b/docassemble/PetitionForRuleToShowCauseFamily/data/templates/order_rule_family.docx
@@ -2918,6 +2918,8 @@
     <w:p>
       <w:pPr>
         <w:pStyle w:val="BodyText"/>
+        <w:keepNext/>
+        <w:keepLines/>
         <w:spacing w:before="38" w:line="360" w:lineRule="auto"/>
         <w:rPr>
           <w:sz w:val="24"/>
@@ -2935,6 +2937,8 @@
     <w:p>
       <w:pPr>
         <w:pStyle w:val="BodyText"/>
+        <w:keepNext/>
+        <w:keepLines/>
         <w:spacing w:before="38" w:line="360" w:lineRule="auto"/>
         <w:rPr>
           <w:sz w:val="24"/>
@@ -2952,6 +2956,7 @@
     <w:p>
       <w:pPr>
         <w:pStyle w:val="BodyText"/>
+        <w:keepLines/>
         <w:spacing w:before="38" w:line="360" w:lineRule="auto"/>
         <w:rPr>
           <w:sz w:val="24"/>
@@ -4223,12 +4228,7 @@
       </w:pPr>
     </w:p>
     <w:sectPr>
-      <w:headerReference w:type="even" r:id="rId7"/>
-      <w:headerReference w:type="default" r:id="rId8"/>
-      <w:footerReference w:type="even" r:id="rId9"/>
-      <w:footerReference w:type="default" r:id="rId10"/>
-      <w:headerReference w:type="first" r:id="rId11"/>
-      <w:footerReference w:type="first" r:id="rId12"/>
+      <w:footerReference w:type="default" r:id="rId7"/>
       <w:pgSz w:w="12240" w:h="15840"/>
       <w:pgMar w:top="1820" w:right="1440" w:bottom="1220" w:left="1080" w:header="0" w:footer="1037" w:gutter="0"/>
       <w:cols w:space="720"/>
@@ -4257,16 +4257,6 @@
 </file>
 
 <file path=word/footer1.xml><?xml version="1.0" encoding="utf-8"?>
-<w:ftr xmlns:wpc="http://schemas.microsoft.com/office/word/2010/wordprocessingCanvas" xmlns:cx="http://schemas.microsoft.com/office/drawing/2014/chartex" xmlns:cx1="http://schemas.microsoft.com/office/drawing/2015/9/8/chartex" xmlns:cx2="http://schemas.microsoft.com/office/drawing/2015/10/21/chartex" xmlns:cx3="http://schemas.microsoft.com/office/drawing/2016/5/9/chartex" xmlns:cx4="http://schemas.microsoft.com/office/drawing/2016/5/10/chartex" xmlns:cx5="http://schemas.microsoft.com/office/drawing/2016/5/11/chartex" xmlns:cx6="http://schemas.microsoft.com/office/drawing/2016/5/12/chartex" xmlns:cx7="http://schemas.microsoft.com/office/drawing/2016/5/13/chartex" xmlns:cx8="http://schemas.microsoft.com/office/drawing/2016/5/14/chartex" xmlns:mc="http://schemas.openxmlformats.org/markup-compatibility/2006" xmlns:aink="http://schemas.microsoft.com/office/drawing/2016/ink" xmlns:am3d="http://schemas.microsoft.com/office/drawing/2017/model3d" xmlns:o="urn:schemas-microsoft-com:office:office" xmlns:oel="http://schemas.microsoft.com/office/2019/extlst" xmlns:r="http://schemas.openxmlformats.org/officeDocument/2006/relationships" xmlns:m="http://schemas.openxmlformats.org/officeDocument/2006/math" xmlns:v="urn:schemas-microsoft-com:vml" xmlns:wp14="http://schemas.microsoft.com/office/word/2010/wordprocessingDrawing" xmlns:wp="http://schemas.openxmlformats.org/drawingml/2006/wordprocessingDrawing" xmlns:w10="urn:schemas-microsoft-com:office:word" xmlns:w="http://schemas.openxmlformats.org/wordprocessingml/2006/main" xmlns:w14="http://schemas.microsoft.com/office/word/2010/wordml" xmlns:w15="http://schemas.microsoft.com/office/word/2012/wordml" xmlns:w16cex="http://schemas.microsoft.com/office/word/2018/wordml/cex" xmlns:w16cid="http://schemas.microsoft.com/office/word/2016/wordml/cid" xmlns:w16="http://schemas.microsoft.com/office/word/2018/wordml" xmlns:w16du="http://schemas.microsoft.com/office/word/2023/wordml/word16du" xmlns:w16sdtdh="http://schemas.microsoft.com/office/word/2020/wordml/sdtdatahash" xmlns:w16sdtfl="http://schemas.microsoft.com/office/word/2024/wordml/sdtformatlock" xmlns:w16se="http://schemas.microsoft.com/office/word/2015/wordml/symex" xmlns:wpg="http://schemas.microsoft.com/office/word/2010/wordprocessingGroup" xmlns:wpi="http://schemas.microsoft.com/office/word/2010/wordprocessingInk" xmlns:wne="http://schemas.microsoft.com/office/word/2006/wordml" xmlns:wps="http://schemas.microsoft.com/office/word/2010/wordprocessingShape" mc:Ignorable="w14 w15 w16se w16cid w16 w16cex w16sdtdh w16sdtfl w16du wp14">
-  <w:p>
-    <w:pPr>
-      <w:pStyle w:val="Footer"/>
-    </w:pPr>
-  </w:p>
-</w:ftr>
-</file>
-
-<file path=word/footer2.xml><?xml version="1.0" encoding="utf-8"?>
 <w:ftr xmlns:wpc="http://schemas.microsoft.com/office/word/2010/wordprocessingCanvas" xmlns:cx="http://schemas.microsoft.com/office/drawing/2014/chartex" xmlns:cx1="http://schemas.microsoft.com/office/drawing/2015/9/8/chartex" xmlns:cx2="http://schemas.microsoft.com/office/drawing/2015/10/21/chartex" xmlns:cx3="http://schemas.microsoft.com/office/drawing/2016/5/9/chartex" xmlns:cx4="http://schemas.microsoft.com/office/drawing/2016/5/10/chartex" xmlns:cx5="http://schemas.microsoft.com/office/drawing/2016/5/11/chartex" xmlns:cx6="http://schemas.microsoft.com/office/drawing/2016/5/12/chartex" xmlns:cx7="http://schemas.microsoft.com/office/drawing/2016/5/13/chartex" xmlns:cx8="http://schemas.microsoft.com/office/drawing/2016/5/14/chartex" xmlns:mc="http://schemas.openxmlformats.org/markup-compatibility/2006" xmlns:aink="http://schemas.microsoft.com/office/drawing/2016/ink" xmlns:am3d="http://schemas.microsoft.com/office/drawing/2017/model3d" xmlns:o="urn:schemas-microsoft-com:office:office" xmlns:oel="http://schemas.microsoft.com/office/2019/extlst" xmlns:r="http://schemas.openxmlformats.org/officeDocument/2006/relationships" xmlns:m="http://schemas.openxmlformats.org/officeDocument/2006/math" xmlns:v="urn:schemas-microsoft-com:vml" xmlns:wp14="http://schemas.microsoft.com/office/word/2010/wordprocessingDrawing" xmlns:wp="http://schemas.openxmlformats.org/drawingml/2006/wordprocessingDrawing" xmlns:w10="urn:schemas-microsoft-com:office:word" xmlns:w="http://schemas.openxmlformats.org/wordprocessingml/2006/main" xmlns:w14="http://schemas.microsoft.com/office/word/2010/wordml" xmlns:w15="http://schemas.microsoft.com/office/word/2012/wordml" xmlns:w16cex="http://schemas.microsoft.com/office/word/2018/wordml/cex" xmlns:w16cid="http://schemas.microsoft.com/office/word/2016/wordml/cid" xmlns:w16="http://schemas.microsoft.com/office/word/2018/wordml" xmlns:w16du="http://schemas.microsoft.com/office/word/2023/wordml/word16du" xmlns:w16sdtdh="http://schemas.microsoft.com/office/word/2020/wordml/sdtdatahash" xmlns:w16sdtfl="http://schemas.microsoft.com/office/word/2024/wordml/sdtformatlock" xmlns:w16se="http://schemas.microsoft.com/office/word/2015/wordml/symex" xmlns:wpg="http://schemas.microsoft.com/office/word/2010/wordprocessingGroup" xmlns:wpi="http://schemas.microsoft.com/office/word/2010/wordprocessingInk" xmlns:wne="http://schemas.microsoft.com/office/word/2006/wordml" xmlns:wps="http://schemas.microsoft.com/office/word/2010/wordprocessingShape" mc:Ignorable="w14 w15 w16se w16cid w16 w16cex w16sdtdh w16sdtfl w16du wp14">
   <w:sdt>
     <w:sdtPr>
@@ -4365,16 +4355,6 @@
 </w:ftr>
 </file>
 
-<file path=word/footer3.xml><?xml version="1.0" encoding="utf-8"?>
-<w:ftr xmlns:wpc="http://schemas.microsoft.com/office/word/2010/wordprocessingCanvas" xmlns:cx="http://schemas.microsoft.com/office/drawing/2014/chartex" xmlns:cx1="http://schemas.microsoft.com/office/drawing/2015/9/8/chartex" xmlns:cx2="http://schemas.microsoft.com/office/drawing/2015/10/21/chartex" xmlns:cx3="http://schemas.microsoft.com/office/drawing/2016/5/9/chartex" xmlns:cx4="http://schemas.microsoft.com/office/drawing/2016/5/10/chartex" xmlns:cx5="http://schemas.microsoft.com/office/drawing/2016/5/11/chartex" xmlns:cx6="http://schemas.microsoft.com/office/drawing/2016/5/12/chartex" xmlns:cx7="http://schemas.microsoft.com/office/drawing/2016/5/13/chartex" xmlns:cx8="http://schemas.microsoft.com/office/drawing/2016/5/14/chartex" xmlns:mc="http://schemas.openxmlformats.org/markup-compatibility/2006" xmlns:aink="http://schemas.microsoft.com/office/drawing/2016/ink" xmlns:am3d="http://schemas.microsoft.com/office/drawing/2017/model3d" xmlns:o="urn:schemas-microsoft-com:office:office" xmlns:oel="http://schemas.microsoft.com/office/2019/extlst" xmlns:r="http://schemas.openxmlformats.org/officeDocument/2006/relationships" xmlns:m="http://schemas.openxmlformats.org/officeDocument/2006/math" xmlns:v="urn:schemas-microsoft-com:vml" xmlns:wp14="http://schemas.microsoft.com/office/word/2010/wordprocessingDrawing" xmlns:wp="http://schemas.openxmlformats.org/drawingml/2006/wordprocessingDrawing" xmlns:w10="urn:schemas-microsoft-com:office:word" xmlns:w="http://schemas.openxmlformats.org/wordprocessingml/2006/main" xmlns:w14="http://schemas.microsoft.com/office/word/2010/wordml" xmlns:w15="http://schemas.microsoft.com/office/word/2012/wordml" xmlns:w16cex="http://schemas.microsoft.com/office/word/2018/wordml/cex" xmlns:w16cid="http://schemas.microsoft.com/office/word/2016/wordml/cid" xmlns:w16="http://schemas.microsoft.com/office/word/2018/wordml" xmlns:w16du="http://schemas.microsoft.com/office/word/2023/wordml/word16du" xmlns:w16sdtdh="http://schemas.microsoft.com/office/word/2020/wordml/sdtdatahash" xmlns:w16sdtfl="http://schemas.microsoft.com/office/word/2024/wordml/sdtformatlock" xmlns:w16se="http://schemas.microsoft.com/office/word/2015/wordml/symex" xmlns:wpg="http://schemas.microsoft.com/office/word/2010/wordprocessingGroup" xmlns:wpi="http://schemas.microsoft.com/office/word/2010/wordprocessingInk" xmlns:wne="http://schemas.microsoft.com/office/word/2006/wordml" xmlns:wps="http://schemas.microsoft.com/office/word/2010/wordprocessingShape" mc:Ignorable="w14 w15 w16se w16cid w16 w16cex w16sdtdh w16sdtfl w16du wp14">
-  <w:p>
-    <w:pPr>
-      <w:pStyle w:val="Footer"/>
-    </w:pPr>
-  </w:p>
-</w:ftr>
-</file>
-
 <file path=word/footnotes.xml><?xml version="1.0" encoding="utf-8"?>
 <w:footnotes xmlns:wpc="http://schemas.microsoft.com/office/word/2010/wordprocessingCanvas" xmlns:cx="http://schemas.microsoft.com/office/drawing/2014/chartex" xmlns:cx1="http://schemas.microsoft.com/office/drawing/2015/9/8/chartex" xmlns:cx2="http://schemas.microsoft.com/office/drawing/2015/10/21/chartex" xmlns:cx3="http://schemas.microsoft.com/office/drawing/2016/5/9/chartex" xmlns:cx4="http://schemas.microsoft.com/office/drawing/2016/5/10/chartex" xmlns:cx5="http://schemas.microsoft.com/office/drawing/2016/5/11/chartex" xmlns:cx6="http://schemas.microsoft.com/office/drawing/2016/5/12/chartex" xmlns:cx7="http://schemas.microsoft.com/office/drawing/2016/5/13/chartex" xmlns:cx8="http://schemas.microsoft.com/office/drawing/2016/5/14/chartex" xmlns:mc="http://schemas.openxmlformats.org/markup-compatibility/2006" xmlns:aink="http://schemas.microsoft.com/office/drawing/2016/ink" xmlns:am3d="http://schemas.microsoft.com/office/drawing/2017/model3d" xmlns:o="urn:schemas-microsoft-com:office:office" xmlns:oel="http://schemas.microsoft.com/office/2019/extlst" xmlns:r="http://schemas.openxmlformats.org/officeDocument/2006/relationships" xmlns:m="http://schemas.openxmlformats.org/officeDocument/2006/math" xmlns:v="urn:schemas-microsoft-com:vml" xmlns:wp14="http://schemas.microsoft.com/office/word/2010/wordprocessingDrawing" xmlns:wp="http://schemas.openxmlformats.org/drawingml/2006/wordprocessingDrawing" xmlns:w10="urn:schemas-microsoft-com:office:word" xmlns:w="http://schemas.openxmlformats.org/wordprocessingml/2006/main" xmlns:w14="http://schemas.microsoft.com/office/word/2010/wordml" xmlns:w15="http://schemas.microsoft.com/office/word/2012/wordml" xmlns:w16cex="http://schemas.microsoft.com/office/word/2018/wordml/cex" xmlns:w16cid="http://schemas.microsoft.com/office/word/2016/wordml/cid" xmlns:w16="http://schemas.microsoft.com/office/word/2018/wordml" xmlns:w16du="http://schemas.microsoft.com/office/word/2023/wordml/word16du" xmlns:w16sdtdh="http://schemas.microsoft.com/office/word/2020/wordml/sdtdatahash" xmlns:w16sdtfl="http://schemas.microsoft.com/office/word/2024/wordml/sdtformatlock" xmlns:w16se="http://schemas.microsoft.com/office/word/2015/wordml/symex" xmlns:wpg="http://schemas.microsoft.com/office/word/2010/wordprocessingGroup" xmlns:wpi="http://schemas.microsoft.com/office/word/2010/wordprocessingInk" xmlns:wne="http://schemas.microsoft.com/office/word/2006/wordml" xmlns:wps="http://schemas.microsoft.com/office/word/2010/wordprocessingShape" mc:Ignorable="w14 w15 w16se w16cid w16 w16cex w16sdtdh w16sdtfl w16du wp14">
   <w:footnote w:type="separator" w:id="-1">
@@ -4392,36 +4372,6 @@
     </w:p>
   </w:footnote>
 </w:footnotes>
-</file>
-
-<file path=word/header1.xml><?xml version="1.0" encoding="utf-8"?>
-<w:hdr xmlns:wpc="http://schemas.microsoft.com/office/word/2010/wordprocessingCanvas" xmlns:cx="http://schemas.microsoft.com/office/drawing/2014/chartex" xmlns:cx1="http://schemas.microsoft.com/office/drawing/2015/9/8/chartex" xmlns:cx2="http://schemas.microsoft.com/office/drawing/2015/10/21/chartex" xmlns:cx3="http://schemas.microsoft.com/office/drawing/2016/5/9/chartex" xmlns:cx4="http://schemas.microsoft.com/office/drawing/2016/5/10/chartex" xmlns:cx5="http://schemas.microsoft.com/office/drawing/2016/5/11/chartex" xmlns:cx6="http://schemas.microsoft.com/office/drawing/2016/5/12/chartex" xmlns:cx7="http://schemas.microsoft.com/office/drawing/2016/5/13/chartex" xmlns:cx8="http://schemas.microsoft.com/office/drawing/2016/5/14/chartex" xmlns:mc="http://schemas.openxmlformats.org/markup-compatibility/2006" xmlns:aink="http://schemas.microsoft.com/office/drawing/2016/ink" xmlns:am3d="http://schemas.microsoft.com/office/drawing/2017/model3d" xmlns:o="urn:schemas-microsoft-com:office:office" xmlns:oel="http://schemas.microsoft.com/office/2019/extlst" xmlns:r="http://schemas.openxmlformats.org/officeDocument/2006/relationships" xmlns:m="http://schemas.openxmlformats.org/officeDocument/2006/math" xmlns:v="urn:schemas-microsoft-com:vml" xmlns:wp14="http://schemas.microsoft.com/office/word/2010/wordprocessingDrawing" xmlns:wp="http://schemas.openxmlformats.org/drawingml/2006/wordprocessingDrawing" xmlns:w10="urn:schemas-microsoft-com:office:word" xmlns:w="http://schemas.openxmlformats.org/wordprocessingml/2006/main" xmlns:w14="http://schemas.microsoft.com/office/word/2010/wordml" xmlns:w15="http://schemas.microsoft.com/office/word/2012/wordml" xmlns:w16cex="http://schemas.microsoft.com/office/word/2018/wordml/cex" xmlns:w16cid="http://schemas.microsoft.com/office/word/2016/wordml/cid" xmlns:w16="http://schemas.microsoft.com/office/word/2018/wordml" xmlns:w16du="http://schemas.microsoft.com/office/word/2023/wordml/word16du" xmlns:w16sdtdh="http://schemas.microsoft.com/office/word/2020/wordml/sdtdatahash" xmlns:w16sdtfl="http://schemas.microsoft.com/office/word/2024/wordml/sdtformatlock" xmlns:w16se="http://schemas.microsoft.com/office/word/2015/wordml/symex" xmlns:wpg="http://schemas.microsoft.com/office/word/2010/wordprocessingGroup" xmlns:wpi="http://schemas.microsoft.com/office/word/2010/wordprocessingInk" xmlns:wne="http://schemas.microsoft.com/office/word/2006/wordml" xmlns:wps="http://schemas.microsoft.com/office/word/2010/wordprocessingShape" mc:Ignorable="w14 w15 w16se w16cid w16 w16cex w16sdtdh w16sdtfl w16du wp14">
-  <w:p>
-    <w:pPr>
-      <w:pStyle w:val="Header"/>
-    </w:pPr>
-  </w:p>
-</w:hdr>
-</file>
-
-<file path=word/header2.xml><?xml version="1.0" encoding="utf-8"?>
-<w:hdr xmlns:wpc="http://schemas.microsoft.com/office/word/2010/wordprocessingCanvas" xmlns:cx="http://schemas.microsoft.com/office/drawing/2014/chartex" xmlns:cx1="http://schemas.microsoft.com/office/drawing/2015/9/8/chartex" xmlns:cx2="http://schemas.microsoft.com/office/drawing/2015/10/21/chartex" xmlns:cx3="http://schemas.microsoft.com/office/drawing/2016/5/9/chartex" xmlns:cx4="http://schemas.microsoft.com/office/drawing/2016/5/10/chartex" xmlns:cx5="http://schemas.microsoft.com/office/drawing/2016/5/11/chartex" xmlns:cx6="http://schemas.microsoft.com/office/drawing/2016/5/12/chartex" xmlns:cx7="http://schemas.microsoft.com/office/drawing/2016/5/13/chartex" xmlns:cx8="http://schemas.microsoft.com/office/drawing/2016/5/14/chartex" xmlns:mc="http://schemas.openxmlformats.org/markup-compatibility/2006" xmlns:aink="http://schemas.microsoft.com/office/drawing/2016/ink" xmlns:am3d="http://schemas.microsoft.com/office/drawing/2017/model3d" xmlns:o="urn:schemas-microsoft-com:office:office" xmlns:oel="http://schemas.microsoft.com/office/2019/extlst" xmlns:r="http://schemas.openxmlformats.org/officeDocument/2006/relationships" xmlns:m="http://schemas.openxmlformats.org/officeDocument/2006/math" xmlns:v="urn:schemas-microsoft-com:vml" xmlns:wp14="http://schemas.microsoft.com/office/word/2010/wordprocessingDrawing" xmlns:wp="http://schemas.openxmlformats.org/drawingml/2006/wordprocessingDrawing" xmlns:w10="urn:schemas-microsoft-com:office:word" xmlns:w="http://schemas.openxmlformats.org/wordprocessingml/2006/main" xmlns:w14="http://schemas.microsoft.com/office/word/2010/wordml" xmlns:w15="http://schemas.microsoft.com/office/word/2012/wordml" xmlns:w16cex="http://schemas.microsoft.com/office/word/2018/wordml/cex" xmlns:w16cid="http://schemas.microsoft.com/office/word/2016/wordml/cid" xmlns:w16="http://schemas.microsoft.com/office/word/2018/wordml" xmlns:w16du="http://schemas.microsoft.com/office/word/2023/wordml/word16du" xmlns:w16sdtdh="http://schemas.microsoft.com/office/word/2020/wordml/sdtdatahash" xmlns:w16sdtfl="http://schemas.microsoft.com/office/word/2024/wordml/sdtformatlock" xmlns:w16se="http://schemas.microsoft.com/office/word/2015/wordml/symex" xmlns:wpg="http://schemas.microsoft.com/office/word/2010/wordprocessingGroup" xmlns:wpi="http://schemas.microsoft.com/office/word/2010/wordprocessingInk" xmlns:wne="http://schemas.microsoft.com/office/word/2006/wordml" xmlns:wps="http://schemas.microsoft.com/office/word/2010/wordprocessingShape" mc:Ignorable="w14 w15 w16se w16cid w16 w16cex w16sdtdh w16sdtfl w16du wp14">
-  <w:p>
-    <w:pPr>
-      <w:pStyle w:val="Header"/>
-    </w:pPr>
-  </w:p>
-</w:hdr>
-</file>
-
-<file path=word/header3.xml><?xml version="1.0" encoding="utf-8"?>
-<w:hdr xmlns:wpc="http://schemas.microsoft.com/office/word/2010/wordprocessingCanvas" xmlns:cx="http://schemas.microsoft.com/office/drawing/2014/chartex" xmlns:cx1="http://schemas.microsoft.com/office/drawing/2015/9/8/chartex" xmlns:cx2="http://schemas.microsoft.com/office/drawing/2015/10/21/chartex" xmlns:cx3="http://schemas.microsoft.com/office/drawing/2016/5/9/chartex" xmlns:cx4="http://schemas.microsoft.com/office/drawing/2016/5/10/chartex" xmlns:cx5="http://schemas.microsoft.com/office/drawing/2016/5/11/chartex" xmlns:cx6="http://schemas.microsoft.com/office/drawing/2016/5/12/chartex" xmlns:cx7="http://schemas.microsoft.com/office/drawing/2016/5/13/chartex" xmlns:cx8="http://schemas.microsoft.com/office/drawing/2016/5/14/chartex" xmlns:mc="http://schemas.openxmlformats.org/markup-compatibility/2006" xmlns:aink="http://schemas.microsoft.com/office/drawing/2016/ink" xmlns:am3d="http://schemas.microsoft.com/office/drawing/2017/model3d" xmlns:o="urn:schemas-microsoft-com:office:office" xmlns:oel="http://schemas.microsoft.com/office/2019/extlst" xmlns:r="http://schemas.openxmlformats.org/officeDocument/2006/relationships" xmlns:m="http://schemas.openxmlformats.org/officeDocument/2006/math" xmlns:v="urn:schemas-microsoft-com:vml" xmlns:wp14="http://schemas.microsoft.com/office/word/2010/wordprocessingDrawing" xmlns:wp="http://schemas.openxmlformats.org/drawingml/2006/wordprocessingDrawing" xmlns:w10="urn:schemas-microsoft-com:office:word" xmlns:w="http://schemas.openxmlformats.org/wordprocessingml/2006/main" xmlns:w14="http://schemas.microsoft.com/office/word/2010/wordml" xmlns:w15="http://schemas.microsoft.com/office/word/2012/wordml" xmlns:w16cex="http://schemas.microsoft.com/office/word/2018/wordml/cex" xmlns:w16cid="http://schemas.microsoft.com/office/word/2016/wordml/cid" xmlns:w16="http://schemas.microsoft.com/office/word/2018/wordml" xmlns:w16du="http://schemas.microsoft.com/office/word/2023/wordml/word16du" xmlns:w16sdtdh="http://schemas.microsoft.com/office/word/2020/wordml/sdtdatahash" xmlns:w16sdtfl="http://schemas.microsoft.com/office/word/2024/wordml/sdtformatlock" xmlns:w16se="http://schemas.microsoft.com/office/word/2015/wordml/symex" xmlns:wpg="http://schemas.microsoft.com/office/word/2010/wordprocessingGroup" xmlns:wpi="http://schemas.microsoft.com/office/word/2010/wordprocessingInk" xmlns:wne="http://schemas.microsoft.com/office/word/2006/wordml" xmlns:wps="http://schemas.microsoft.com/office/word/2010/wordprocessingShape" mc:Ignorable="w14 w15 w16se w16cid w16 w16cex w16sdtdh w16sdtfl w16du wp14">
-  <w:p>
-    <w:pPr>
-      <w:pStyle w:val="Header"/>
-    </w:pPr>
-  </w:p>
-</w:hdr>
 </file>
 
 <file path=word/numbering.xml><?xml version="1.0" encoding="utf-8"?>

</xml_diff>